<commit_message>
Chỉnh kế hoạch Vùng trời bình yên cho khớp công văn bản v1
- Trường THPT Trung Giã, Sóc Sơn, Hà Nội; địa danh Hà Nội; tháng 10 hoặc 11/2026
- Chuyên đề "Bầu trời đẹp và bình yên"; dùng "thiết bị bay (flycam, UAV, drone)"
- Bỏ nội dung hậu quả pháp lý/xử phạt; 03 học sinh nhận quà mỗi lớp (09 học sinh)
- Hình ảnh học sinh cần đồng ý của Nhà trường và từng học sinh; cập nhật công văn bản v1

Co-Authored-By: Claude Sonnet 5.5 <noreply@anthropic.com>
Claude-Session: https://claude.ai/code/session_015C98ace9n5uzm6zD1hqQgS
</commit_message>
<xml_diff>
--- a/docs/an-toan-hang-khong/KH_Vung_troi_binh_yen_THPT_BVOT.docx
+++ b/docs/an-toan-hang-khong/KH_Vung_troi_binh_yen_THPT_BVOT.docx
@@ -163,7 +163,7 @@
                 <w:sz w:val="26"/>
                 <w:szCs w:val="26"/>
               </w:rPr>
-              <w:t xml:space="preserve">TP. Hồ Chí Minh, ngày     tháng     năm 2026</w:t>
+              <w:t xml:space="preserve">Hà Nội, ngày     tháng     năm 2026</w:t>
             </w:r>
           </w:p>
         </w:tc>
@@ -221,6 +221,13 @@
         </w:rPr>
         <w:t xml:space="preserve">“VÙNG TRỜI BÌNH YÊN”</w:t>
       </w:r>
+      <w:r>
+        <w:rPr>
+          <w:sz w:val="30"/>
+          <w:szCs w:val="30"/>
+        </w:rPr>
+        <w:t xml:space="preserve"> (tên tạm gọi)</w:t>
+      </w:r>
     </w:p>
     <w:p>
       <w:pPr>
@@ -228,7 +235,16 @@
         <w:jc w:val="center"/>
       </w:pPr>
       <w:r>
-        <w:t xml:space="preserve">Dành cho học sinh Trung học phổ thông – Năm học 2026 – 2027</w:t>
+        <w:t xml:space="preserve">Dành cho học sinh Trường Trung học phổ thông Trung Giã, Sóc Sơn, Hà Nội</w:t>
+      </w:r>
+    </w:p>
+    <w:p>
+      <w:pPr>
+        <w:spacing w:after="40" w:before="0" w:line="288"/>
+        <w:jc w:val="center"/>
+      </w:pPr>
+      <w:r>
+        <w:t xml:space="preserve">Năm học 2026 – 2027</w:t>
       </w:r>
     </w:p>
     <w:p>
@@ -323,7 +339,7 @@
         <w:t xml:space="preserve">nhận diện nguy cơ</w:t>
       </w:r>
       <w:r>
-        <w:t xml:space="preserve"> mất an toàn hàng không từ 03 nhóm hành vi: (1) thả diều, bóng bay, đèn trời; (2) sử dụng flycam, drone; (3) chiếu đèn laser, đèn công suất lớn lên bầu trời gần khu vực sân bay.</w:t>
+        <w:t xml:space="preserve"> mất an toàn hàng không từ 03 nhóm hành vi: (1) thả diều, bóng bay, đèn trời; (2) sử dụng thiết bị bay (flycam, UAV, drone); (3) chiếu đèn laser, đèn công suất lớn lên vùng trời ở khu vực gần sân bay.</w:t>
       </w:r>
     </w:p>
     <w:p>
@@ -344,10 +360,10 @@
           <w:b/>
           <w:bCs/>
         </w:rPr>
-        <w:t xml:space="preserve">hậu quả pháp lý</w:t>
-      </w:r>
-      <w:r>
-        <w:t xml:space="preserve"> của các hành vi vi phạm; biết vui chơi đúng nơi, đúng cách và biết thông báo cho người có trách nhiệm khi phát hiện nguy cơ.</w:t>
+        <w:t xml:space="preserve">vì sao những hành vi này có thể gây nguy hiểm</w:t>
+      </w:r>
+      <w:r>
+        <w:t xml:space="preserve">; biết vui chơi đúng nơi, đúng cách và biết thông báo cho người có trách nhiệm khi phát hiện nguy cơ.</w:t>
       </w:r>
     </w:p>
     <w:p>
@@ -368,7 +384,7 @@
         <w:t xml:space="preserve">Khảo sát</w:t>
       </w:r>
       <w:r>
-        <w:t xml:space="preserve"> nhận thức, thói quen của học sinh tại 03 lớp đại diện để tổng hợp, báo cáo cơ quan có thẩm quyền, phục vụ công tác tuyên truyền an toàn hàng không.</w:t>
+        <w:t xml:space="preserve"> nhận thức của học sinh tại 03 lớp đại diện, tổng hợp dưới dạng số liệu chung, không thể hiện danh tính học sinh hay tên trường.</w:t>
       </w:r>
     </w:p>
     <w:p>
@@ -396,7 +412,7 @@
         <w:jc w:val="both"/>
       </w:pPr>
       <w:r>
-        <w:t xml:space="preserve">Nội dung ngắn gọn, dễ hiểu, phù hợp lứa tuổi THPT; tích cực, không sử dụng hình ảnh tai nạn gây sợ hãi.</w:t>
+        <w:t xml:space="preserve">Nội dung ngắn gọn, dễ hiểu, phù hợp lứa tuổi THPT; tích cực, không sử dụng hình ảnh gây sợ hãi.</w:t>
       </w:r>
     </w:p>
     <w:p>
@@ -417,7 +433,7 @@
         <w:t xml:space="preserve">An toàn tuyệt đối:</w:t>
       </w:r>
       <w:r>
-        <w:t xml:space="preserve"> Không thả diều, không bay flycam, không sử dụng đèn laser hoặc đèn chiếu công suất lớn trong suốt chương trình.</w:t>
+        <w:t xml:space="preserve"> Ban tổ chức (BVOT) không thả diều, không bay flycam/drone/UAV, không sử dụng đèn laser hoặc đèn chiếu công suất lớn trong khuôn viên trường.</w:t>
       </w:r>
     </w:p>
     <w:p>
@@ -637,7 +653,7 @@
                 <w:sz w:val="24"/>
                 <w:szCs w:val="24"/>
               </w:rPr>
-              <w:t xml:space="preserve">- Thời gian: 30 phút, sáng thứ Hai trong tháng 10/2026 (ngày cụ thể do Nhà trường lựa chọn).</w:t>
+              <w:t xml:space="preserve">- Thời gian: 30 phút, sáng thứ Hai trong tháng 10 hoặc tháng 11/2026 (ngày cụ thể do Nhà trường lựa chọn).</w:t>
             </w:r>
           </w:p>
           <w:p>
@@ -774,6 +790,23 @@
         <w:jc w:val="both"/>
       </w:pPr>
       <w:r>
+        <w:t xml:space="preserve">Chuyên đề: </w:t>
+      </w:r>
+      <w:r>
+        <w:rPr>
+          <w:b/>
+          <w:bCs/>
+        </w:rPr>
+        <w:t xml:space="preserve">“Bầu trời đẹp và bình yên – cùng nhận diện các nguy cơ gần sân bay”.</w:t>
+      </w:r>
+    </w:p>
+    <w:p>
+      <w:pPr>
+        <w:spacing w:after="80" w:before="0" w:line="288"/>
+        <w:ind w:firstLine="567"/>
+        <w:jc w:val="both"/>
+      </w:pPr>
+      <w:r>
         <w:t xml:space="preserve">Thông điệp chính: </w:t>
       </w:r>
       <w:r>
@@ -781,7 +814,7 @@
           <w:b/>
           <w:bCs/>
         </w:rPr>
-        <w:t xml:space="preserve">“Diều bay xa sân bay – Flycam bay đúng phép – Ánh sáng không chiếu lên trời”.</w:t>
+        <w:t xml:space="preserve">“Diều bay xa sân bay – Thiết bị bay đúng nơi được phép – Ánh sáng không chiếu lên trời”.</w:t>
       </w:r>
     </w:p>
     <w:p>
@@ -795,7 +828,7 @@
           <w:b/>
           <w:bCs/>
         </w:rPr>
-        <w:t xml:space="preserve">1. Ba nhóm nguy cơ trên bầu trời gần sân bay</w:t>
+        <w:t xml:space="preserve">1. Ba nhóm nguy cơ trên vùng trời gần sân bay</w:t>
       </w:r>
     </w:p>
     <w:tbl>
@@ -811,10 +844,9 @@
         </w:tblBorders>
       </w:tblPr>
       <w:tblGrid>
-        <w:gridCol w:w="1700"/>
-        <w:gridCol w:w="2650"/>
-        <w:gridCol w:w="2550"/>
-        <w:gridCol w:w="2455"/>
+        <w:gridCol w:w="2000"/>
+        <w:gridCol w:w="3900"/>
+        <w:gridCol w:w="3455"/>
       </w:tblGrid>
       <w:tr>
         <w:trPr>
@@ -822,7 +854,7 @@
         </w:trPr>
         <w:tc>
           <w:tcPr>
-            <w:tcW w:type="dxa" w:w="1700"/>
+            <w:tcW w:type="dxa" w:w="2000"/>
             <w:tcBorders>
               <w:top w:val="single" w:color="000000" w:sz="4"/>
               <w:left w:val="single" w:color="000000" w:sz="4"/>
@@ -856,7 +888,7 @@
         </w:tc>
         <w:tc>
           <w:tcPr>
-            <w:tcW w:type="dxa" w:w="2650"/>
+            <w:tcW w:type="dxa" w:w="3900"/>
             <w:tcBorders>
               <w:top w:val="single" w:color="000000" w:sz="4"/>
               <w:left w:val="single" w:color="000000" w:sz="4"/>
@@ -890,41 +922,7 @@
         </w:tc>
         <w:tc>
           <w:tcPr>
-            <w:tcW w:type="dxa" w:w="2550"/>
-            <w:tcBorders>
-              <w:top w:val="single" w:color="000000" w:sz="4"/>
-              <w:left w:val="single" w:color="000000" w:sz="4"/>
-              <w:bottom w:val="single" w:color="000000" w:sz="4"/>
-              <w:right w:val="single" w:color="000000" w:sz="4"/>
-            </w:tcBorders>
-            <w:shd w:fill="D9E2F3" w:color="auto" w:val="clear"/>
-            <w:tcMar>
-              <w:top w:type="dxa" w:w="60"/>
-              <w:left w:type="dxa" w:w="100"/>
-              <w:bottom w:type="dxa" w:w="60"/>
-              <w:right w:type="dxa" w:w="100"/>
-            </w:tcMar>
-            <w:vAlign w:val="center"/>
-          </w:tcPr>
-          <w:p>
-            <w:pPr>
-              <w:spacing w:after="40" w:before="0" w:line="264"/>
-              <w:jc w:val="center"/>
-            </w:pPr>
-            <w:r>
-              <w:rPr>
-                <w:b/>
-                <w:bCs/>
-                <w:sz w:val="24"/>
-                <w:szCs w:val="24"/>
-              </w:rPr>
-              <w:t xml:space="preserve">Hậu quả pháp lý</w:t>
-            </w:r>
-          </w:p>
-        </w:tc>
-        <w:tc>
-          <w:tcPr>
-            <w:tcW w:type="dxa" w:w="2455"/>
+            <w:tcW w:type="dxa" w:w="3455"/>
             <w:tcBorders>
               <w:top w:val="single" w:color="000000" w:sz="4"/>
               <w:left w:val="single" w:color="000000" w:sz="4"/>
@@ -963,7 +961,7 @@
         </w:trPr>
         <w:tc>
           <w:tcPr>
-            <w:tcW w:type="dxa" w:w="1700"/>
+            <w:tcW w:type="dxa" w:w="2000"/>
             <w:tcBorders>
               <w:top w:val="single" w:color="000000" w:sz="4"/>
               <w:left w:val="single" w:color="000000" w:sz="4"/>
@@ -996,7 +994,7 @@
         </w:tc>
         <w:tc>
           <w:tcPr>
-            <w:tcW w:type="dxa" w:w="2650"/>
+            <w:tcW w:type="dxa" w:w="3900"/>
             <w:tcBorders>
               <w:top w:val="single" w:color="000000" w:sz="4"/>
               <w:left w:val="single" w:color="000000" w:sz="4"/>
@@ -1053,7 +1051,7 @@
         </w:tc>
         <w:tc>
           <w:tcPr>
-            <w:tcW w:type="dxa" w:w="2550"/>
+            <w:tcW w:type="dxa" w:w="3455"/>
             <w:tcBorders>
               <w:top w:val="single" w:color="000000" w:sz="4"/>
               <w:left w:val="single" w:color="000000" w:sz="4"/>
@@ -1078,63 +1076,6 @@
                 <w:sz w:val="24"/>
                 <w:szCs w:val="24"/>
               </w:rPr>
-              <w:t xml:space="preserve">- Thả diều, bóng bay, đèn trời, vật thể bay trong khu vực cấm bay, hạn chế bay có thể bị xử phạt vi phạm hành chính.</w:t>
-            </w:r>
-          </w:p>
-          <w:p>
-            <w:pPr>
-              <w:spacing w:after="40" w:before="0" w:line="264"/>
-              <w:jc w:val="left"/>
-            </w:pPr>
-            <w:r>
-              <w:rPr>
-                <w:sz w:val="24"/>
-                <w:szCs w:val="24"/>
-              </w:rPr>
-              <w:t xml:space="preserve">- Gây hậu quả nghiêm trọng có thể bị truy cứu trách nhiệm hình sự.</w:t>
-            </w:r>
-          </w:p>
-          <w:p>
-            <w:pPr>
-              <w:spacing w:after="40" w:before="0" w:line="264"/>
-              <w:jc w:val="left"/>
-            </w:pPr>
-            <w:r>
-              <w:rPr>
-                <w:sz w:val="24"/>
-                <w:szCs w:val="24"/>
-              </w:rPr>
-              <w:t xml:space="preserve">- Cha mẹ, người giám hộ có thể phải bồi thường thiệt hại do con chưa thành niên gây ra.</w:t>
-            </w:r>
-          </w:p>
-        </w:tc>
-        <w:tc>
-          <w:tcPr>
-            <w:tcW w:type="dxa" w:w="2455"/>
-            <w:tcBorders>
-              <w:top w:val="single" w:color="000000" w:sz="4"/>
-              <w:left w:val="single" w:color="000000" w:sz="4"/>
-              <w:bottom w:val="single" w:color="000000" w:sz="4"/>
-              <w:right w:val="single" w:color="000000" w:sz="4"/>
-            </w:tcBorders>
-            <w:tcMar>
-              <w:top w:type="dxa" w:w="60"/>
-              <w:left w:type="dxa" w:w="100"/>
-              <w:bottom w:type="dxa" w:w="60"/>
-              <w:right w:type="dxa" w:w="100"/>
-            </w:tcMar>
-            <w:vAlign w:val="top"/>
-          </w:tcPr>
-          <w:p>
-            <w:pPr>
-              <w:spacing w:after="40" w:before="0" w:line="264"/>
-              <w:jc w:val="left"/>
-            </w:pPr>
-            <w:r>
-              <w:rPr>
-                <w:sz w:val="24"/>
-                <w:szCs w:val="24"/>
-              </w:rPr>
               <w:t xml:space="preserve">- Chỉ thả diều ở bãi đất trống xa sân bay, xa đường dây điện.</w:t>
             </w:r>
           </w:p>
@@ -1148,7 +1089,7 @@
                 <w:sz w:val="24"/>
                 <w:szCs w:val="24"/>
               </w:rPr>
-              <w:t xml:space="preserve">- Tìm hiểu khu vực cấm trước khi chơi.</w:t>
+              <w:t xml:space="preserve">- Tìm hiểu khu vực cấm, hạn chế trước khi chơi.</w:t>
             </w:r>
           </w:p>
           <w:p>
@@ -1172,7 +1113,7 @@
         </w:trPr>
         <w:tc>
           <w:tcPr>
-            <w:tcW w:type="dxa" w:w="1700"/>
+            <w:tcW w:type="dxa" w:w="2000"/>
             <w:tcBorders>
               <w:top w:val="single" w:color="000000" w:sz="4"/>
               <w:left w:val="single" w:color="000000" w:sz="4"/>
@@ -1199,13 +1140,13 @@
                 <w:sz w:val="24"/>
                 <w:szCs w:val="24"/>
               </w:rPr>
-              <w:t xml:space="preserve">2. Flycam, drone</w:t>
-            </w:r>
-          </w:p>
-        </w:tc>
-        <w:tc>
-          <w:tcPr>
-            <w:tcW w:type="dxa" w:w="2650"/>
+              <w:t xml:space="preserve">2. Thiết bị bay (flycam, UAV, drone)</w:t>
+            </w:r>
+          </w:p>
+        </w:tc>
+        <w:tc>
+          <w:tcPr>
+            <w:tcW w:type="dxa" w:w="3900"/>
             <w:tcBorders>
               <w:top w:val="single" w:color="000000" w:sz="4"/>
               <w:left w:val="single" w:color="000000" w:sz="4"/>
@@ -1256,13 +1197,13 @@
                 <w:sz w:val="24"/>
                 <w:szCs w:val="24"/>
               </w:rPr>
-              <w:t xml:space="preserve">- Có thể xâm phạm khu vực quân sự, mục tiêu cần bảo vệ.</w:t>
-            </w:r>
-          </w:p>
-        </w:tc>
-        <w:tc>
-          <w:tcPr>
-            <w:tcW w:type="dxa" w:w="2550"/>
+              <w:t xml:space="preserve">- Có thể bay vào khu vực quân sự, mục tiêu cần bảo vệ.</w:t>
+            </w:r>
+          </w:p>
+        </w:tc>
+        <w:tc>
+          <w:tcPr>
+            <w:tcW w:type="dxa" w:w="3455"/>
             <w:tcBorders>
               <w:top w:val="single" w:color="000000" w:sz="4"/>
               <w:left w:val="single" w:color="000000" w:sz="4"/>
@@ -1287,51 +1228,7 @@
                 <w:sz w:val="24"/>
                 <w:szCs w:val="24"/>
               </w:rPr>
-              <w:t xml:space="preserve">- Flycam phải được đăng ký, cấp phép bay theo quy định.</w:t>
-            </w:r>
-          </w:p>
-          <w:p>
-            <w:pPr>
-              <w:spacing w:after="40" w:before="0" w:line="264"/>
-              <w:jc w:val="left"/>
-            </w:pPr>
-            <w:r>
-              <w:rPr>
-                <w:sz w:val="24"/>
-                <w:szCs w:val="24"/>
-              </w:rPr>
-              <w:t xml:space="preserve">- Bay không phép, bay trong khu vực cấm bay, hạn chế bay có thể bị xử phạt, tịch thu phương tiện; trường hợp nghiêm trọng có thể bị truy cứu trách nhiệm hình sự.</w:t>
-            </w:r>
-          </w:p>
-        </w:tc>
-        <w:tc>
-          <w:tcPr>
-            <w:tcW w:type="dxa" w:w="2455"/>
-            <w:tcBorders>
-              <w:top w:val="single" w:color="000000" w:sz="4"/>
-              <w:left w:val="single" w:color="000000" w:sz="4"/>
-              <w:bottom w:val="single" w:color="000000" w:sz="4"/>
-              <w:right w:val="single" w:color="000000" w:sz="4"/>
-            </w:tcBorders>
-            <w:tcMar>
-              <w:top w:type="dxa" w:w="60"/>
-              <w:left w:type="dxa" w:w="100"/>
-              <w:bottom w:type="dxa" w:w="60"/>
-              <w:right w:type="dxa" w:w="100"/>
-            </w:tcMar>
-            <w:vAlign w:val="top"/>
-          </w:tcPr>
-          <w:p>
-            <w:pPr>
-              <w:spacing w:after="40" w:before="0" w:line="264"/>
-              <w:jc w:val="left"/>
-            </w:pPr>
-            <w:r>
-              <w:rPr>
-                <w:sz w:val="24"/>
-                <w:szCs w:val="24"/>
-              </w:rPr>
-              <w:t xml:space="preserve">- Không tự ý bay flycam khi chưa được phép.</w:t>
+              <w:t xml:space="preserve">- Chỉ sử dụng ở nơi được phép, có người lớn hướng dẫn; thiết bị bay cần được đăng ký, cấp phép theo quy định.</w:t>
             </w:r>
           </w:p>
           <w:p>
@@ -1355,7 +1252,7 @@
         </w:trPr>
         <w:tc>
           <w:tcPr>
-            <w:tcW w:type="dxa" w:w="1700"/>
+            <w:tcW w:type="dxa" w:w="2000"/>
             <w:tcBorders>
               <w:top w:val="single" w:color="000000" w:sz="4"/>
               <w:left w:val="single" w:color="000000" w:sz="4"/>
@@ -1388,7 +1285,7 @@
         </w:tc>
         <w:tc>
           <w:tcPr>
-            <w:tcW w:type="dxa" w:w="2650"/>
+            <w:tcW w:type="dxa" w:w="3900"/>
             <w:tcBorders>
               <w:top w:val="single" w:color="000000" w:sz="4"/>
               <w:left w:val="single" w:color="000000" w:sz="4"/>
@@ -1432,51 +1329,7 @@
         </w:tc>
         <w:tc>
           <w:tcPr>
-            <w:tcW w:type="dxa" w:w="2550"/>
-            <w:tcBorders>
-              <w:top w:val="single" w:color="000000" w:sz="4"/>
-              <w:left w:val="single" w:color="000000" w:sz="4"/>
-              <w:bottom w:val="single" w:color="000000" w:sz="4"/>
-              <w:right w:val="single" w:color="000000" w:sz="4"/>
-            </w:tcBorders>
-            <w:tcMar>
-              <w:top w:type="dxa" w:w="60"/>
-              <w:left w:type="dxa" w:w="100"/>
-              <w:bottom w:type="dxa" w:w="60"/>
-              <w:right w:type="dxa" w:w="100"/>
-            </w:tcMar>
-            <w:vAlign w:val="top"/>
-          </w:tcPr>
-          <w:p>
-            <w:pPr>
-              <w:spacing w:after="40" w:before="0" w:line="264"/>
-              <w:jc w:val="left"/>
-            </w:pPr>
-            <w:r>
-              <w:rPr>
-                <w:sz w:val="24"/>
-                <w:szCs w:val="24"/>
-              </w:rPr>
-              <w:t xml:space="preserve">- Chiếu laser, ánh sáng công suất lớn gây ảnh hưởng đến hoạt động bay là hành vi bị nghiêm cấm, có thể bị xử phạt.</w:t>
-            </w:r>
-          </w:p>
-          <w:p>
-            <w:pPr>
-              <w:spacing w:after="40" w:before="0" w:line="264"/>
-              <w:jc w:val="left"/>
-            </w:pPr>
-            <w:r>
-              <w:rPr>
-                <w:sz w:val="24"/>
-                <w:szCs w:val="24"/>
-              </w:rPr>
-              <w:t xml:space="preserve">- Gây hậu quả nghiêm trọng có thể bị truy cứu trách nhiệm hình sự.</w:t>
-            </w:r>
-          </w:p>
-        </w:tc>
-        <w:tc>
-          <w:tcPr>
-            <w:tcW w:type="dxa" w:w="2455"/>
+            <w:tcW w:type="dxa" w:w="3455"/>
             <w:tcBorders>
               <w:top w:val="single" w:color="000000" w:sz="4"/>
               <w:left w:val="single" w:color="000000" w:sz="4"/>
@@ -1522,22 +1375,6 @@
     </w:tbl>
     <w:p>
       <w:pPr>
-        <w:spacing w:after="80" w:before="0" w:line="288"/>
-        <w:ind w:firstLine="567"/>
-        <w:jc w:val="both"/>
-      </w:pPr>
-      <w:r>
-        <w:rPr>
-          <w:i/>
-          <w:iCs/>
-          <w:sz w:val="24"/>
-          <w:szCs w:val="24"/>
-        </w:rPr>
-        <w:t xml:space="preserve">Ghi chú: Mức xử phạt cụ thể và khu vực cấm bay, hạn chế bay tại địa phương được BVOT cập nhật theo văn bản pháp luật hiện hành và hướng dẫn của cơ quan chuyên môn.</w:t>
-      </w:r>
-    </w:p>
-    <w:p>
-      <w:pPr>
         <w:keepNext/>
         <w:spacing w:after="80" w:before="100" w:line="288"/>
         <w:jc w:val="both"/>
@@ -1591,17 +1428,17 @@
         <w:t xml:space="preserve">(2)</w:t>
       </w:r>
       <w:r>
-        <w:t xml:space="preserve"> Flycam phải </w:t>
-      </w:r>
-      <w:r>
-        <w:rPr>
-          <w:b/>
-          <w:bCs/>
-        </w:rPr>
-        <w:t xml:space="preserve">được phép</w:t>
-      </w:r>
-      <w:r>
-        <w:t xml:space="preserve"> mới được bay – </w:t>
+        <w:t xml:space="preserve"> Thiết bị bay (flycam, UAV, drone) chỉ bay </w:t>
+      </w:r>
+      <w:r>
+        <w:rPr>
+          <w:b/>
+          <w:bCs/>
+        </w:rPr>
+        <w:t xml:space="preserve">đúng nơi được phép</w:t>
+      </w:r>
+      <w:r>
+        <w:t xml:space="preserve"> – </w:t>
       </w:r>
       <w:r>
         <w:rPr>
@@ -2254,7 +2091,7 @@
                 <w:sz w:val="24"/>
                 <w:szCs w:val="24"/>
               </w:rPr>
-              <w:t xml:space="preserve">Chuyên đề “3 nhóm nguy cơ trên bầu trời gần sân bay”: diều – bóng bay – đèn trời; flycam – drone; laser – ánh sáng công suất lớn; hậu quả pháp lý (minh họa bằng tranh ảnh khổ lớn).</w:t>
+              <w:t xml:space="preserve">Chuyên đề “Bầu trời đẹp và bình yên – cùng nhận diện các nguy cơ gần sân bay”: diều – bóng bay – đèn trời; thiết bị bay (flycam, UAV, drone); laser – ánh sáng công suất lớn (minh họa bằng tranh ảnh khổ lớn).</w:t>
             </w:r>
           </w:p>
         </w:tc>
@@ -2620,7 +2457,7 @@
         <w:t xml:space="preserve">mã số học sinh (nếu Nhà trường đồng ý)</w:t>
       </w:r>
       <w:r>
-        <w:t xml:space="preserve">, dùng duy nhất để xác định học sinh nhận quà. Số liệu được báo cáo dưới dạng tổng hợp, không thể hiện danh tính học sinh hay tên trường.</w:t>
+        <w:t xml:space="preserve">, dùng duy nhất để xác định học sinh nhận quà. Số liệu được tổng hợp dưới dạng số liệu chung, không thể hiện danh tính học sinh hay tên trường.</w:t>
       </w:r>
     </w:p>
     <w:p>
@@ -2648,10 +2485,10 @@
           <w:b/>
           <w:bCs/>
         </w:rPr>
-        <w:t xml:space="preserve">03 học sinh</w:t>
-      </w:r>
-      <w:r>
-        <w:t xml:space="preserve"> có bài khảo sát trả lời hợp lý nhất được nhận quà. Tiêu chí xét: (1) số câu trả lời đúng Phần A nhiều nhất; (2) nếu bằng điểm, xét câu trả lời Phần C hợp lý, sáng tạo hơn; (3) nếu vẫn bằng nhau, xét thời điểm nộp phiếu sớm hơn.</w:t>
+        <w:t xml:space="preserve">03 học sinh trong mỗi lớp</w:t>
+      </w:r>
+      <w:r>
+        <w:t xml:space="preserve"> (tổng cộng 09 học sinh) có bài khảo sát trả lời hợp lý nhất được nhận quà. Tiêu chí xét: (1) số câu trả lời đúng Phần A nhiều nhất; (2) nếu bằng điểm, xét câu trả lời Phần C hợp lý, sáng tạo hơn; (3) nếu vẫn bằng nhau, xét thời điểm nộp phiếu sớm hơn. Tiêu chí được áp dụng riêng cho từng lớp.</w:t>
       </w:r>
     </w:p>
     <w:p>
@@ -2672,7 +2509,7 @@
         <w:t xml:space="preserve">Kết quả:</w:t>
       </w:r>
       <w:r>
-        <w:t xml:space="preserve"> Danh sách 03 học sinh nhận quà (theo mã số học sinh) và báo cáo tóm tắt số liệu được gửi Nhà trường trong vòng 07 ngày làm việc sau khảo sát.</w:t>
+        <w:t xml:space="preserve"> Danh sách học sinh nhận quà (theo mã số học sinh) và báo cáo tóm tắt số liệu chung được gửi Nhà trường trong vòng 07 ngày làm việc sau khảo sát.</w:t>
       </w:r>
     </w:p>
     <w:p>
@@ -3434,7 +3271,7 @@
                 <w:sz w:val="24"/>
                 <w:szCs w:val="24"/>
               </w:rPr>
-              <w:t xml:space="preserve">Tổng hợp khảo sát, xác định 03 học sinh nhận quà, trao quà</w:t>
+              <w:t xml:space="preserve">Tổng hợp khảo sát, xác định 03 học sinh nhận quà mỗi lớp, trao quà</w:t>
             </w:r>
           </w:p>
         </w:tc>
@@ -3525,7 +3362,7 @@
         <w:jc w:val="both"/>
       </w:pPr>
       <w:r>
-        <w:t xml:space="preserve">Toàn bộ kinh phí tổ chức, ấn phẩm, quà tặng do Công ty TNHH BVOT GROUP bảo đảm. Nhà trường không phải chi trả; không thu bất kỳ khoản tiền nào của học sinh.</w:t>
+        <w:t xml:space="preserve">Toàn bộ kinh phí tổ chức, ấn phẩm, quà tặng do Ban tổ chức (Công ty TNHH BVOT GROUP) bảo đảm. Nhà trường không phải chi trả; không thu bất kỳ khoản tiền nào của học sinh.</w:t>
       </w:r>
     </w:p>
     <w:p>
@@ -3561,7 +3398,7 @@
         <w:jc w:val="both"/>
       </w:pPr>
       <w:r>
-        <w:t xml:space="preserve">2. Không thả diều, không bay flycam, không sử dụng đèn laser, đèn chiếu công suất lớn trong chương trình.</w:t>
+        <w:t xml:space="preserve">2. Ban tổ chức (BVOT) không thả diều, không bay flycam/drone/UAV, không sử dụng đèn laser hoặc đèn chiếu công suất lớn trong khuôn viên trường.</w:t>
       </w:r>
     </w:p>
     <w:p>
@@ -3571,7 +3408,7 @@
         <w:jc w:val="both"/>
       </w:pPr>
       <w:r>
-        <w:t xml:space="preserve">3. Không tổ chức bán hàng; hình ảnh học sinh chỉ sử dụng khi có sự đồng ý của Nhà trường.</w:t>
+        <w:t xml:space="preserve">3. Không tổ chức bán hàng; không ảnh hưởng đến hoạt động dạy và học; hình ảnh học sinh chỉ sử dụng khi có sự đồng ý của Nhà trường và của từng học sinh.</w:t>
       </w:r>
     </w:p>
     <w:p>
@@ -3659,7 +3496,7 @@
                 <w:sz w:val="22"/>
                 <w:szCs w:val="22"/>
               </w:rPr>
-              <w:t xml:space="preserve">- Ban Giám hiệu Trường THPT ………………;</w:t>
+              <w:t xml:space="preserve">- Ban Giám hiệu Trường THPT Trung Giã, Sóc Sơn, Hà Nội;</w:t>
             </w:r>
           </w:p>
           <w:p>
@@ -3997,7 +3834,7 @@
         <w:t xml:space="preserve">Câu 2.</w:t>
       </w:r>
       <w:r>
-        <w:t xml:space="preserve"> Tàu bay dễ bị ảnh hưởng nhất bởi diều, flycam ở giai đoạn nào?</w:t>
+        <w:t xml:space="preserve"> Tàu bay dễ bị ảnh hưởng nhất bởi diều, thiết bị bay (flycam, UAV, drone) ở giai đoạn nào?</w:t>
       </w:r>
     </w:p>
     <w:p>
@@ -4181,7 +4018,7 @@
         <w:t xml:space="preserve">Câu 4.</w:t>
       </w:r>
       <w:r>
-        <w:t xml:space="preserve"> Muốn sử dụng flycam hợp pháp, cần làm gì?</w:t>
+        <w:t xml:space="preserve"> Muốn sử dụng thiết bị bay (flycam, UAV, drone) đúng quy định, cần làm gì?</w:t>
       </w:r>
     </w:p>
     <w:p>
@@ -4365,7 +4202,7 @@
         <w:t xml:space="preserve">Câu 6.</w:t>
       </w:r>
       <w:r>
-        <w:t xml:space="preserve"> Khu vực nào tuyệt đối không được bay flycam khi chưa được phép?</w:t>
+        <w:t xml:space="preserve"> Khu vực nào tuyệt đối không được bay thiết bị bay (flycam, UAV, drone) khi chưa được phép?</w:t>
       </w:r>
     </w:p>
     <w:p>
@@ -4549,7 +4386,7 @@
         <w:t xml:space="preserve">Câu 8.</w:t>
       </w:r>
       <w:r>
-        <w:t xml:space="preserve"> Học sinh chưa thành niên thả diều gây thiệt hại cho hoạt động bay thì ai có thể phải bồi thường?</w:t>
+        <w:t xml:space="preserve"> Trước khi chơi diều hoặc điều khiển thiết bị bay, em nên làm gì đầu tiên?</w:t>
       </w:r>
     </w:p>
     <w:p>
@@ -4563,7 +4400,7 @@
           <w:sz w:val="24"/>
           <w:szCs w:val="24"/>
         </w:rPr>
-        <w:t xml:space="preserve">A. Không ai phải chịu trách nhiệm</w:t>
+        <w:t xml:space="preserve">A. Rủ thật nhiều bạn đến sân bay xem cho vui</w:t>
       </w:r>
     </w:p>
     <w:p>
@@ -4577,7 +4414,16 @@
           <w:sz w:val="24"/>
           <w:szCs w:val="24"/>
         </w:rPr>
-        <w:t xml:space="preserve">B. Chỉ người bán diều</w:t>
+        <w:t xml:space="preserve">B. Tìm hiểu nơi được phép chơi, tránh khu vực gần sân bay và nhờ người lớn hướng dẫn  </w:t>
+      </w:r>
+      <w:r>
+        <w:rPr>
+          <w:b/>
+          <w:bCs/>
+          <w:sz w:val="24"/>
+          <w:szCs w:val="24"/>
+        </w:rPr>
+        <w:t xml:space="preserve">(Đáp án đúng)</w:t>
       </w:r>
     </w:p>
     <w:p>
@@ -4591,16 +4437,7 @@
           <w:sz w:val="24"/>
           <w:szCs w:val="24"/>
         </w:rPr>
-        <w:t xml:space="preserve">C. Cha mẹ hoặc người giám hộ có thể phải bồi thường thiệt hại theo quy định của pháp luật  </w:t>
-      </w:r>
-      <w:r>
-        <w:rPr>
-          <w:b/>
-          <w:bCs/>
-          <w:sz w:val="24"/>
-          <w:szCs w:val="24"/>
-        </w:rPr>
-        <w:t xml:space="preserve">(Đáp án đúng)</w:t>
+        <w:t xml:space="preserve">C. Chơi ở bất cứ nơi nào có gió</w:t>
       </w:r>
     </w:p>
     <w:p>
@@ -4614,7 +4451,7 @@
           <w:sz w:val="24"/>
           <w:szCs w:val="24"/>
         </w:rPr>
-        <w:t xml:space="preserve">D. Hãng hàng không tự chịu</w:t>
+        <w:t xml:space="preserve">D. Chơi vào ban đêm để không ai thấy</w:t>
       </w:r>
     </w:p>
     <w:p>
@@ -4977,7 +4814,7 @@
         <w:t xml:space="preserve">Câu 13.</w:t>
       </w:r>
       <w:r>
-        <w:t xml:space="preserve"> Em hoặc gia đình có flycam, bút laser không? (có thể chọn nhiều đáp án)</w:t>
+        <w:t xml:space="preserve"> Em hoặc gia đình có thiết bị bay (flycam, UAV, drone), bút laser không? (có thể chọn nhiều đáp án)</w:t>
       </w:r>
     </w:p>
     <w:p>
@@ -4991,7 +4828,7 @@
           <w:sz w:val="24"/>
           <w:szCs w:val="24"/>
         </w:rPr>
-        <w:t xml:space="preserve">☐ Có flycam</w:t>
+        <w:t xml:space="preserve">☐ Có thiết bị bay (flycam, UAV, drone)</w:t>
       </w:r>
     </w:p>
     <w:p>
@@ -5223,7 +5060,7 @@
           <w:b/>
           <w:bCs/>
         </w:rPr>
-        <w:t xml:space="preserve">Phần C – Câu hỏi mở (dùng để xét chọn 03 học sinh nhận quà khi bằng điểm)</w:t>
+        <w:t xml:space="preserve">Phần C – Câu hỏi mở (dùng để xét chọn 03 học sinh nhận quà mỗi lớp khi bằng điểm)</w:t>
       </w:r>
     </w:p>
     <w:p>

</xml_diff>